<commit_message>
Update McCarthy Assignment 3.2.docx
</commit_message>
<xml_diff>
--- a/module 3/McCarthy Assignment 3.2.docx
+++ b/module 3/McCarthy Assignment 3.2.docx
@@ -9,6 +9,24 @@
     </w:p>
     <w:p>
       <w:r>
+        <w:t>Noah McCarthy</w:t>
+      </w:r>
+    </w:p>
+    <w:p>
+      <w:r>
+        <w:t>Assignment 3.2</w:t>
+      </w:r>
+    </w:p>
+    <w:p>
+      <w:r>
+        <w:t>https://yeetoneto.github.io/CSD-340/</w:t>
+      </w:r>
+    </w:p>
+    <w:p>
+      <w:r>
+        <w:rPr>
+          <w:noProof/>
+        </w:rPr>
         <w:drawing>
           <wp:inline distT="0" distB="0" distL="0" distR="0" wp14:anchorId="72EF0B61" wp14:editId="3680738B">
             <wp:extent cx="5943600" cy="2946400"/>
@@ -48,6 +66,9 @@
     </w:p>
     <w:p>
       <w:r>
+        <w:rPr>
+          <w:noProof/>
+        </w:rPr>
         <w:drawing>
           <wp:inline distT="0" distB="0" distL="0" distR="0" wp14:anchorId="0CB46955" wp14:editId="3540EA8C">
             <wp:extent cx="5943600" cy="1715770"/>
@@ -87,6 +108,9 @@
     </w:p>
     <w:p>
       <w:r>
+        <w:rPr>
+          <w:noProof/>
+        </w:rPr>
         <w:lastRenderedPageBreak/>
         <w:drawing>
           <wp:inline distT="0" distB="0" distL="0" distR="0" wp14:anchorId="15097069" wp14:editId="394CCBBA">
@@ -739,6 +763,7 @@
   <w:style w:type="character" w:default="1" w:styleId="DefaultParagraphFont">
     <w:name w:val="Default Paragraph Font"/>
     <w:uiPriority w:val="1"/>
+    <w:semiHidden/>
     <w:unhideWhenUsed/>
   </w:style>
   <w:style w:type="table" w:default="1" w:styleId="TableNormal">
@@ -1051,6 +1076,29 @@
       <w:smallCaps/>
       <w:color w:val="2F5496" w:themeColor="accent1" w:themeShade="BF"/>
       <w:spacing w:val="5"/>
+    </w:rPr>
+  </w:style>
+  <w:style w:type="character" w:styleId="Hyperlink">
+    <w:name w:val="Hyperlink"/>
+    <w:basedOn w:val="DefaultParagraphFont"/>
+    <w:uiPriority w:val="99"/>
+    <w:unhideWhenUsed/>
+    <w:rsid w:val="007E0497"/>
+    <w:rPr>
+      <w:color w:val="0563C1" w:themeColor="hyperlink"/>
+      <w:u w:val="single"/>
+    </w:rPr>
+  </w:style>
+  <w:style w:type="character" w:styleId="UnresolvedMention">
+    <w:name w:val="Unresolved Mention"/>
+    <w:basedOn w:val="DefaultParagraphFont"/>
+    <w:uiPriority w:val="99"/>
+    <w:semiHidden/>
+    <w:unhideWhenUsed/>
+    <w:rsid w:val="007E0497"/>
+    <w:rPr>
+      <w:color w:val="605E5C"/>
+      <w:shd w:val="clear" w:color="auto" w:fill="E1DFDD"/>
     </w:rPr>
   </w:style>
 </w:styles>

</xml_diff>